<commit_message>
Renders and samples for the reworked w:ptab PRs
</commit_message>
<xml_diff>
--- a/ptab.docx
+++ b/ptab.docx
@@ -50,6 +50,33 @@
       </w:r>
       <w:r>
         <w:t xml:space="preserve">17</w:t>
+      </w:r>
+    </w:p>
+    <w:p>
+      <w:pPr/>
+      <w:r>
+        <w:t xml:space="preserve">3. Appendix</w:t>
+      </w:r>
+      <w:r>
+        <w:ptab w:relativeTo="margin" w:alignment="right" w:leader="middleDot"/>
+      </w:r>
+      <w:r>
+        <w:t xml:space="preserve">42</w:t>
+      </w:r>
+    </w:p>
+    <w:p>
+      <w:pPr/>
+      <w:r>
+        <w:t xml:space="preserve">Signature</w:t>
+      </w:r>
+      <w:r>
+        <w:ptab w:relativeTo="margin" w:alignment="center" w:leader="underscore"/>
+      </w:r>
+      <w:r>
+        <w:t xml:space="preserve">Date</w:t>
+      </w:r>
+      <w:r>
+        <w:ptab w:relativeTo="margin" w:alignment="right" w:leader="underscore"/>
       </w:r>
     </w:p>
     <w:p>

</xml_diff>